<commit_message>
Add support for Markdown blockquotes
Parse Markdig QuoteBlock into DocumentBlock.Blockquote (one or more
paragraphs; nested non-paragraph content is rejected). Add BlockStyleKey.Blockquote
and a dedicated IStyleResolver.ResolveBlockquoteStyle, kept separate from the
generic ResolveBlockStyle so the "error when unconfigured" behavior of the
other block kinds is untouched.

Mirrors the link fallback: configured -> named style (error if unresolvable);
unconfigured -> guess the canonical "Quote" style, falling back to direct
paragraph indentation (w:ind w:left="720") with a warning if the template
doesn't define it. StyleMappingConfigurationGenerator picks up the same
canonical-name guess for free via the existing BlockStyleKindRegistry lookup.
</commit_message>
<xml_diff>
--- a/examples/template.docx
+++ b/examples/template.docx
@@ -681,8 +681,18 @@
                                           <w:sz w:val="36"/>
                                           <w:szCs w:val="36"/>
                                         </w:rPr>
-                                        <w:t>Sample document</w:t>
+                                        <w:t xml:space="preserve">Sample </w:t>
                                       </w:r>
+                                      <w:proofErr w:type="spellStart"/>
+                                      <w:r>
+                                        <w:rPr>
+                                          <w:color w:val="156082" w:themeColor="accent1"/>
+                                          <w:sz w:val="36"/>
+                                          <w:szCs w:val="36"/>
+                                        </w:rPr>
+                                        <w:t>document</w:t>
+                                      </w:r>
+                                      <w:proofErr w:type="spellEnd"/>
                                     </w:p>
                                   </w:sdtContent>
                                 </w:sdt>
@@ -823,8 +833,18 @@
                                     <w:sz w:val="36"/>
                                     <w:szCs w:val="36"/>
                                   </w:rPr>
-                                  <w:t>Sample document</w:t>
+                                  <w:t xml:space="preserve">Sample </w:t>
                                 </w:r>
+                                <w:proofErr w:type="spellStart"/>
+                                <w:r>
+                                  <w:rPr>
+                                    <w:color w:val="156082" w:themeColor="accent1"/>
+                                    <w:sz w:val="36"/>
+                                    <w:szCs w:val="36"/>
+                                  </w:rPr>
+                                  <w:t>document</w:t>
+                                </w:r>
+                                <w:proofErr w:type="spellEnd"/>
                               </w:p>
                             </w:sdtContent>
                           </w:sdt>
@@ -848,8 +868,21 @@
     <w:p>
       <w:r>
         <w:lastRenderedPageBreak/>
-        <w:t>Table of Contents</w:t>
+        <w:t xml:space="preserve">Table </w:t>
       </w:r>
+      <w:proofErr w:type="spellStart"/>
+      <w:r>
+        <w:t>of</w:t>
+      </w:r>
+      <w:proofErr w:type="spellEnd"/>
+      <w:r>
+        <w:t xml:space="preserve"> </w:t>
+      </w:r>
+      <w:proofErr w:type="spellStart"/>
+      <w:r>
+        <w:t>Contents</w:t>
+      </w:r>
+      <w:proofErr w:type="spellEnd"/>
     </w:p>
     <w:p>
       <w:fldSimple w:instr=" TOC \o &quot;1-3&quot; \h \z \u ">
@@ -885,13 +918,12 @@
       <w:pPr>
         <w:pStyle w:val="Nadpis1"/>
       </w:pPr>
+      <w:proofErr w:type="spellStart"/>
       <w:r>
         <w:lastRenderedPageBreak/>
-        <w:t>A</w:t>
+        <w:t>Appendix</w:t>
       </w:r>
-      <w:r>
-        <w:t>ppendix</w:t>
-      </w:r>
+      <w:proofErr w:type="spellEnd"/>
     </w:p>
     <w:p>
       <w:r>
@@ -1961,6 +1993,29 @@
     <w:uiPriority w:val="99"/>
     <w:rsid w:val="001821CD"/>
   </w:style>
+  <w:style w:type="character" w:styleId="Hypertextovodkaz">
+    <w:name w:val="Hyperlink"/>
+    <w:basedOn w:val="Standardnpsmoodstavce"/>
+    <w:uiPriority w:val="99"/>
+    <w:unhideWhenUsed/>
+    <w:rsid w:val="00854B0B"/>
+    <w:rPr>
+      <w:color w:val="467886" w:themeColor="hyperlink"/>
+      <w:u w:val="single"/>
+    </w:rPr>
+  </w:style>
+  <w:style w:type="character" w:styleId="Nevyeenzmnka">
+    <w:name w:val="Unresolved Mention"/>
+    <w:basedOn w:val="Standardnpsmoodstavce"/>
+    <w:uiPriority w:val="99"/>
+    <w:semiHidden/>
+    <w:unhideWhenUsed/>
+    <w:rsid w:val="00854B0B"/>
+    <w:rPr>
+      <w:color w:val="605E5C"/>
+      <w:shd w:val="clear" w:color="auto" w:fill="E1DFDD"/>
+    </w:rPr>
+  </w:style>
 </w:styles>
 </file>
 

</xml_diff>